<commit_message>
fix(docx-remediation): wave 02 semantic placeholders for BM-068-163
Co-authored-by: Cursor <cursoragent@cursor.com>
</commit_message>
<xml_diff>
--- a/storage/templates/normalized-docx/BM-068/BM-068_normalized.docx
+++ b/storage/templates/normalized-docx/BM-068/BM-068_normalized.docx
@@ -698,7 +698,7 @@
                 <w:i/>
                 <w:iCs/>
               </w:rPr>
-              <w:t>{{document.field}}</w:t>
+              <w:t>{{document.fullDocumentCode}}</w:t>
             </w:r>
           </w:p>
         </w:tc>
@@ -976,7 +976,7 @@
           <w:rFonts w:cs="Times New Roman" w:ascii="Times New Roman" w:hAnsi="Times New Roman"/>
           <w:spacing w:val="-2"/>
         </w:rPr>
-        <w:t>{{document.field}}</w:t>
+        <w:t>{{document.issueDate}}</w:t>
       </w:r>
       <w:r>
         <w:rPr>
@@ -1027,7 +1027,7 @@
         <w:rPr>
           <w:rFonts w:cs="Times New Roman" w:ascii="Times New Roman" w:hAnsi="Times New Roman"/>
         </w:rPr>
-        <w:t>{{document.field}}</w:t>
+        <w:t>{{person.dateOfBirth}}</w:t>
       </w:r>
     </w:p>
     <w:p>
@@ -1188,7 +1188,7 @@
         <w:rPr>
           <w:rFonts w:cs="Times New Roman" w:ascii="Times New Roman" w:hAnsi="Times New Roman"/>
         </w:rPr>
-        <w:t>{{recipients.field}}</w:t>
+        <w:t>{{recipients.personLine}}</w:t>
       </w:r>
     </w:p>
     <w:p>
@@ -1208,7 +1208,7 @@
         <w:rPr>
           <w:rFonts w:cs="Times New Roman" w:ascii="Times New Roman" w:hAnsi="Times New Roman"/>
         </w:rPr>
-        <w:t>{{recipients.field}}</w:t>
+        <w:t>{{person.permanentAddress}}</w:t>
         <w:tab/>
       </w:r>
     </w:p>
@@ -1229,7 +1229,7 @@
         <w:rPr>
           <w:rFonts w:cs="Times New Roman" w:ascii="Times New Roman" w:hAnsi="Times New Roman"/>
         </w:rPr>
-        <w:t>{{recipients.field}}</w:t>
+        <w:t>{{person.permanentAddress2}}</w:t>
       </w:r>
     </w:p>
     <w:p>
@@ -1249,7 +1249,7 @@
         <w:rPr>
           <w:rFonts w:cs="Times New Roman" w:ascii="Times New Roman" w:hAnsi="Times New Roman"/>
         </w:rPr>
-        <w:t>{{recipients.field}}</w:t>
+        <w:t>{{person.occupation}}</w:t>
       </w:r>
     </w:p>
     <w:p>
@@ -1267,7 +1267,7 @@
         <w:rPr>
           <w:rFonts w:cs="Times New Roman" w:ascii="Times New Roman" w:hAnsi="Times New Roman"/>
         </w:rPr>
-        <w:t>{{recipients.field}}</w:t>
+        <w:t>{{person.idNumber}}</w:t>
         <w:tab/>
       </w:r>
     </w:p>
@@ -1286,7 +1286,7 @@
         <w:rPr>
           <w:rFonts w:cs="Times New Roman" w:ascii="Times New Roman" w:hAnsi="Times New Roman"/>
         </w:rPr>
-        <w:t>{{recipients.field}}</w:t>
+        <w:t>{{person.dateOfBirth}}</w:t>
         <w:tab/>
       </w:r>
     </w:p>
@@ -1307,7 +1307,7 @@
         <w:rPr>
           <w:rFonts w:cs="Times New Roman" w:ascii="Times New Roman" w:hAnsi="Times New Roman"/>
         </w:rPr>
-        <w:t>{{recipients.field}}</w:t>
+        <w:t>{{person.permanentAddress3}}</w:t>
       </w:r>
     </w:p>
     <w:p>
@@ -1327,7 +1327,7 @@
         <w:rPr>
           <w:rFonts w:cs="Times New Roman" w:ascii="Times New Roman" w:hAnsi="Times New Roman"/>
         </w:rPr>
-        <w:t>{{recipients.field}}</w:t>
+        <w:t>{{person.occupation2}}</w:t>
         <w:tab/>
       </w:r>
     </w:p>
@@ -1348,7 +1348,7 @@
         <w:rPr>
           <w:rFonts w:cs="Times New Roman" w:ascii="Times New Roman" w:hAnsi="Times New Roman"/>
         </w:rPr>
-        <w:t>{{recipients.field}}</w:t>
+        <w:t>{{person.idNumber2}}</w:t>
       </w:r>
     </w:p>
     <w:p>
@@ -1364,9 +1364,9 @@
         <w:rPr>
           <w:rFonts w:cs="Times New Roman" w:ascii="Times New Roman" w:hAnsi="Times New Roman"/>
         </w:rPr>
-        <w:t>{{recipients.field}}</w:t>
+        <w:t>{{person.temporaryAddress}}</w:t>
         <w:tab/>
-        <w:t>{{recipients.field}}</w:t>
+        <w:t>{{person.province}}</w:t>
       </w:r>
     </w:p>
     <w:p>
@@ -1686,7 +1686,7 @@
                 <w:sz w:val="24"/>
                 <w:szCs w:val="26"/>
               </w:rPr>
-              <w:t>{{recipients.field}}</w:t>
+              <w:t>{{person.idNumber}}</w:t>
             </w:r>
           </w:p>
           <w:p>

</xml_diff>